<commit_message>
Ajout du schéma prototype d'ensemble
</commit_message>
<xml_diff>
--- a/Documents/LHO - M7 - DT.docx
+++ b/Documents/LHO - M7 - DT.docx
@@ -958,6 +958,7 @@
           <w:r>
             <w:fldChar w:fldCharType="separate"/>
           </w:r>
+          <w:r/>
           <w:hyperlink w:tooltip="#_Toc1" w:anchor="_Toc1" w:history="1">
             <w:r>
               <w:rPr>
@@ -987,7 +988,6 @@
             </w:r>
           </w:hyperlink>
           <w:r/>
-          <w:r/>
         </w:p>
         <w:p>
           <w:pPr>
@@ -1000,7 +1000,6 @@
             <w:ind/>
             <w:rPr/>
           </w:pPr>
-          <w:r/>
           <w:hyperlink w:tooltip="#_Toc2" w:anchor="_Toc2" w:history="1">
             <w:r>
               <w:rPr>
@@ -1037,7 +1036,6 @@
             </w:r>
           </w:hyperlink>
           <w:r/>
-          <w:r/>
         </w:p>
         <w:p>
           <w:pPr>
@@ -1050,7 +1048,6 @@
             <w:ind/>
             <w:rPr/>
           </w:pPr>
-          <w:r/>
           <w:hyperlink w:tooltip="#_Toc3" w:anchor="_Toc3" w:history="1">
             <w:r>
               <w:rPr>
@@ -1087,7 +1084,6 @@
             </w:r>
           </w:hyperlink>
           <w:r/>
-          <w:r/>
         </w:p>
         <w:p>
           <w:pPr>
@@ -1100,7 +1096,6 @@
             <w:ind/>
             <w:rPr/>
           </w:pPr>
-          <w:r/>
           <w:hyperlink w:tooltip="#_Toc4" w:anchor="_Toc4" w:history="1">
             <w:r>
               <w:rPr>
@@ -1131,7 +1126,6 @@
             </w:r>
           </w:hyperlink>
           <w:r/>
-          <w:r/>
         </w:p>
         <w:p>
           <w:pPr>
@@ -1144,7 +1138,6 @@
             <w:ind/>
             <w:rPr/>
           </w:pPr>
-          <w:r/>
           <w:hyperlink w:tooltip="#_Toc5" w:anchor="_Toc5" w:history="1">
             <w:r>
               <w:rPr>
@@ -1180,7 +1173,6 @@
               <w:lang w:val="fr-CH"/>
             </w:rPr>
           </w:r>
-          <w:r/>
         </w:p>
         <w:p>
           <w:pPr>
@@ -1193,7 +1185,6 @@
             <w:ind/>
             <w:rPr/>
           </w:pPr>
-          <w:r/>
           <w:hyperlink w:tooltip="#_Toc6" w:anchor="_Toc6" w:history="1">
             <w:r>
               <w:rPr>
@@ -1244,7 +1235,6 @@
             </w:r>
           </w:hyperlink>
           <w:r/>
-          <w:r/>
         </w:p>
         <w:p>
           <w:pPr>
@@ -1257,7 +1247,6 @@
             <w:ind/>
             <w:rPr/>
           </w:pPr>
-          <w:r/>
           <w:hyperlink w:tooltip="#_Toc7" w:anchor="_Toc7" w:history="1">
             <w:r>
               <w:rPr>
@@ -1300,7 +1289,6 @@
             </w:r>
           </w:hyperlink>
           <w:r/>
-          <w:r/>
         </w:p>
         <w:p>
           <w:pPr>
@@ -1313,7 +1301,6 @@
             <w:ind/>
             <w:rPr/>
           </w:pPr>
-          <w:r/>
           <w:hyperlink w:tooltip="#_Toc8" w:anchor="_Toc8" w:history="1">
             <w:r>
               <w:rPr>
@@ -1383,7 +1370,6 @@
             </w:r>
           </w:hyperlink>
           <w:r/>
-          <w:r/>
         </w:p>
         <w:p>
           <w:pPr>
@@ -1396,7 +1382,6 @@
             <w:ind/>
             <w:rPr/>
           </w:pPr>
-          <w:r/>
           <w:hyperlink w:tooltip="#_Toc9" w:anchor="_Toc9" w:history="1">
             <w:r>
               <w:rPr>
@@ -1440,7 +1425,6 @@
             </w:r>
           </w:hyperlink>
           <w:r/>
-          <w:r/>
         </w:p>
         <w:p>
           <w:pPr>
@@ -1453,7 +1437,6 @@
             <w:ind/>
             <w:rPr/>
           </w:pPr>
-          <w:r/>
           <w:hyperlink w:tooltip="#_Toc10" w:anchor="_Toc10" w:history="1">
             <w:r>
               <w:rPr>
@@ -1491,7 +1474,6 @@
             </w:r>
           </w:hyperlink>
           <w:r/>
-          <w:r/>
         </w:p>
         <w:p>
           <w:pPr>
@@ -1504,7 +1486,6 @@
             <w:ind/>
             <w:rPr/>
           </w:pPr>
-          <w:r/>
           <w:hyperlink w:tooltip="#_Toc11" w:anchor="_Toc11" w:history="1">
             <w:r>
               <w:rPr>
@@ -1548,7 +1529,6 @@
             </w:r>
           </w:hyperlink>
           <w:r/>
-          <w:r/>
         </w:p>
         <w:p>
           <w:pPr>
@@ -1561,7 +1541,6 @@
             <w:ind/>
             <w:rPr/>
           </w:pPr>
-          <w:r/>
           <w:hyperlink w:tooltip="#_Toc12" w:anchor="_Toc12" w:history="1">
             <w:r>
               <w:rPr>
@@ -1617,7 +1596,6 @@
             </w:r>
           </w:hyperlink>
           <w:r/>
-          <w:r/>
         </w:p>
         <w:p>
           <w:pPr>
@@ -1630,7 +1608,6 @@
             <w:ind/>
             <w:rPr/>
           </w:pPr>
-          <w:r/>
           <w:hyperlink w:tooltip="#_Toc13" w:anchor="_Toc13" w:history="1">
             <w:r>
               <w:rPr>
@@ -1663,7 +1640,7 @@
                 <w:rStyle w:val="1250"/>
                 <w:lang w:val="fr-CH"/>
               </w:rPr>
-              <w:t xml:space="preserve">(24-&gt;5VDC)</w:t>
+              <w:t xml:space="preserve">(24v -&gt;3v3)</w:t>
             </w:r>
             <w:r>
               <w:rPr>
@@ -1682,7 +1659,6 @@
             </w:r>
           </w:hyperlink>
           <w:r/>
-          <w:r/>
         </w:p>
         <w:p>
           <w:pPr>
@@ -1695,7 +1671,6 @@
             <w:ind/>
             <w:rPr/>
           </w:pPr>
-          <w:r/>
           <w:hyperlink w:tooltip="#_Toc14" w:anchor="_Toc14" w:history="1">
             <w:r>
               <w:rPr>
@@ -1733,7 +1708,6 @@
             </w:r>
           </w:hyperlink>
           <w:r/>
-          <w:r/>
         </w:p>
         <w:p>
           <w:pPr>
@@ -1746,7 +1720,6 @@
             <w:ind/>
             <w:rPr/>
           </w:pPr>
-          <w:r/>
           <w:hyperlink w:tooltip="#_Toc15" w:anchor="_Toc15" w:history="1">
             <w:r>
               <w:rPr>
@@ -1782,7 +1755,6 @@
               <w:lang w:val="fr-CH"/>
             </w:rPr>
           </w:r>
-          <w:r/>
         </w:p>
         <w:p>
           <w:pPr>
@@ -1795,7 +1767,6 @@
             <w:ind/>
             <w:rPr/>
           </w:pPr>
-          <w:r/>
           <w:hyperlink w:tooltip="#_Toc16" w:anchor="_Toc16" w:history="1">
             <w:r>
               <w:rPr>
@@ -1813,8 +1784,34 @@
             <w:r>
               <w:rPr>
                 <w:rStyle w:val="1250"/>
+                <w:lang w:val="fr-CH"/>
               </w:rPr>
-              <w:t xml:space="preserve">Unité de traitement centrale : Le choix de l'ESP32</w:t>
+              <w:t xml:space="preserve">Microcontroleur</w:t>
+            </w:r>
+            <w:r>
+              <w:rPr>
+                <w:rStyle w:val="1250"/>
+              </w:rPr>
+              <w:t xml:space="preserve"> : </w:t>
+            </w:r>
+            <w:r>
+              <w:rPr>
+                <w:rStyle w:val="1250"/>
+              </w:rPr>
+              <w:t xml:space="preserve">ESP32</w:t>
+            </w:r>
+            <w:r>
+              <w:rPr>
+                <w:rStyle w:val="1250"/>
+                <w:lang w:val="fr-CH"/>
+              </w:rPr>
+              <w:t xml:space="preserve">-</w:t>
+            </w:r>
+            <w:r>
+              <w:rPr>
+                <w:rStyle w:val="1250"/>
+              </w:rPr>
+              <w:t xml:space="preserve">S3/C6</w:t>
             </w:r>
             <w:r>
               <w:rPr>
@@ -1833,7 +1830,6 @@
             </w:r>
           </w:hyperlink>
           <w:r/>
-          <w:r/>
         </w:p>
         <w:p>
           <w:pPr>
@@ -1842,6 +1838,7 @@
             <w:ind/>
             <w:rPr/>
           </w:pPr>
+          <w:r/>
           <w:r>
             <w:rPr>
               <w:b/>
@@ -1849,6 +1846,7 @@
             </w:rPr>
             <w:fldChar w:fldCharType="end"/>
           </w:r>
+          <w:r/>
           <w:r/>
         </w:p>
       </w:sdtContent>
@@ -1884,6 +1882,7 @@
       <w:r>
         <w:t xml:space="preserve">1. Introduction</w:t>
       </w:r>
+      <w:r/>
       <w:bookmarkEnd w:id="1"/>
       <w:r/>
       <w:r/>
@@ -2142,6 +2141,7 @@
       <w:r>
         <w:t xml:space="preserve">Personnes impliquées</w:t>
       </w:r>
+      <w:r/>
       <w:bookmarkEnd w:id="2"/>
       <w:r/>
       <w:r/>
@@ -2298,6 +2298,7 @@
       <w:r>
         <w:t xml:space="preserve">Directives générales</w:t>
       </w:r>
+      <w:r/>
       <w:bookmarkEnd w:id="3"/>
       <w:r/>
       <w:r/>
@@ -2318,6 +2319,7 @@
         </w:rPr>
         <w:t xml:space="preserve">1.2.1 Délais</w:t>
       </w:r>
+      <w:r/>
       <w:bookmarkEnd w:id="4"/>
       <w:r/>
       <w:r/>
@@ -2608,12 +2610,9 @@
         </w:rPr>
         <w:t xml:space="preserve">1.2.2 Livrables</w:t>
       </w:r>
+      <w:r/>
       <w:bookmarkEnd w:id="5"/>
-      <w:r>
-        <w:rPr>
-          <w:lang w:val="fr-CH"/>
-        </w:rPr>
-      </w:r>
+      <w:r/>
       <w:r>
         <w:rPr>
           <w:lang w:val="fr-CH"/>
@@ -2809,6 +2808,7 @@
       <w:r>
         <w:t xml:space="preserve">Spécifications du système</w:t>
       </w:r>
+      <w:r/>
       <w:bookmarkEnd w:id="6"/>
       <w:r/>
       <w:r/>
@@ -2948,6 +2948,7 @@
       <w:r>
         <w:t xml:space="preserve">ible</w:t>
       </w:r>
+      <w:r/>
       <w:bookmarkEnd w:id="7"/>
       <w:r/>
       <w:r/>
@@ -3143,6 +3144,7 @@
       <w:r>
         <w:t xml:space="preserve"> </w:t>
       </w:r>
+      <w:r/>
       <w:bookmarkEnd w:id="8"/>
       <w:r/>
       <w:r/>
@@ -4893,6 +4895,7 @@
         </w:rPr>
         <w:t xml:space="preserve"> </w:t>
       </w:r>
+      <w:r/>
       <w:bookmarkEnd w:id="9"/>
       <w:r/>
       <w:r/>
@@ -4978,6 +4981,7 @@
       <w:r>
         <w:t xml:space="preserve">Vue d'ensemble de l'architecture</w:t>
       </w:r>
+      <w:r/>
       <w:bookmarkEnd w:id="10"/>
       <w:r/>
       <w:r/>
@@ -5258,6 +5262,7 @@
         </w:rPr>
         <w:t xml:space="preserve">RC522</w:t>
       </w:r>
+      <w:r/>
       <w:bookmarkEnd w:id="11"/>
       <w:r/>
       <w:r/>
@@ -5356,6 +5361,7 @@
         </w:rPr>
         <w:t xml:space="preserve"> et MAX3485</w:t>
       </w:r>
+      <w:r/>
       <w:bookmarkEnd w:id="12"/>
       <w:r/>
       <w:r/>
@@ -5703,8 +5709,9 @@
         <w:rPr>
           <w:lang w:val="fr-CH"/>
         </w:rPr>
-        <w:t xml:space="preserve">(24-&gt;5VDC)</w:t>
+        <w:t xml:space="preserve">(24v -&gt;3v3)</w:t>
       </w:r>
+      <w:r/>
       <w:bookmarkEnd w:id="13"/>
       <w:r/>
       <w:r/>
@@ -5808,7 +5815,21 @@
           <w:highlight w:val="none"/>
           <w:lang w:val="fr-CH"/>
         </w:rPr>
-        <w:t xml:space="preserve">Le système devant s'intégrer directement dans les cellules industrielles, l'alimentation primaire fournie en entrée est le standard 24V DC. Pour abaisser et réguler cette tension, le choix s'est porté sur le convertisseur DC-DC TR10S05.</w:t>
+        <w:t xml:space="preserve">Le système devant s'intégrer directement dans les cellules industrielles, l'alimentation primaire fournie en entrée est le standard 24V DC. Pour abaisser et réguler cette tension, le choix s'est porté sur le convertisseur DC-DC </w:t>
+      </w:r>
+      <w:r>
+        <w:rPr>
+          <w:highlight w:val="none"/>
+          <w:lang w:val="fr-CH"/>
+        </w:rPr>
+        <w:t xml:space="preserve">TR10S3V3</w:t>
+      </w:r>
+      <w:r>
+        <w:rPr>
+          <w:highlight w:val="none"/>
+          <w:lang w:val="fr-CH"/>
+        </w:rPr>
+        <w:t xml:space="preserve">.</w:t>
       </w:r>
       <w:r>
         <w:rPr>
@@ -5845,7 +5866,7 @@
           <w:highlight w:val="none"/>
           <w:lang w:val="fr-CH" w:bidi="fr-CH"/>
         </w:rPr>
-        <w:t xml:space="preserve">Il s'agit d'un régulateur à découpage, capable d'accepter une large plage de tension en entrée (de 8V à 28V) pour fournir une tension de sortie stable de 5.0V.</w:t>
+        <w:t xml:space="preserve">Il s'agit d'un régulateur à découpage, capable d'accepter une large plage de tension en entrée (de 8V à 28V) pour fournir une tension de sortie stable de 3.3V.</w:t>
       </w:r>
       <w:r>
         <w:rPr>
@@ -5963,6 +5984,7 @@
       <w:r>
         <w:t xml:space="preserve">Interfaces de contrôle local et de diagnostic</w:t>
       </w:r>
+      <w:r/>
       <w:bookmarkEnd w:id="14"/>
       <w:r/>
       <w:r/>
@@ -6394,12 +6416,9 @@
         </w:rPr>
         <w:t xml:space="preserve">3.6 Branchement / Liaison</w:t>
       </w:r>
+      <w:r/>
       <w:bookmarkEnd w:id="15"/>
-      <w:r>
-        <w:rPr>
-          <w:lang w:val="fr-CH"/>
-        </w:rPr>
-      </w:r>
+      <w:r/>
       <w:r>
         <w:rPr>
           <w:lang w:val="fr-CH"/>
@@ -6561,6 +6580,8 @@
         <w:ind/>
         <w:rPr/>
       </w:pPr>
+      <w:r/>
+      <w:bookmarkStart w:id="16" w:name="_Toc16"/>
       <w:r>
         <w:rPr>
           <w:highlight w:val="none"/>
@@ -6578,8 +6599,20 @@
         <w:t xml:space="preserve"> : </w:t>
       </w:r>
       <w:r>
-        <w:t xml:space="preserve">ESP32S3/C6</w:t>
+        <w:t xml:space="preserve">ESP32</w:t>
       </w:r>
+      <w:r>
+        <w:rPr>
+          <w:lang w:val="fr-CH"/>
+        </w:rPr>
+        <w:t xml:space="preserve">-</w:t>
+      </w:r>
+      <w:r>
+        <w:t xml:space="preserve">S3/C6</w:t>
+      </w:r>
+      <w:r/>
+      <w:bookmarkEnd w:id="16"/>
+      <w:r/>
       <w:r/>
     </w:p>
     <w:p>
@@ -7161,42 +7194,9 @@
         </w:rPr>
       </w:r>
       <w:r/>
-    </w:p>
-    <w:p>
-      <w:pPr>
-        <w:pBdr/>
-        <w:spacing/>
-        <w:ind/>
-        <w:jc w:val="both"/>
-        <w:rPr/>
-      </w:pPr>
       <w:r/>
       <w:r/>
-    </w:p>
-    <w:p>
-      <w:pPr>
-        <w:pBdr/>
-        <w:spacing/>
-        <w:ind/>
-        <w:jc w:val="both"/>
-        <w:rPr>
-          <w:highlight w:val="none"/>
-          <w:lang w:val="fr-CH"/>
-        </w:rPr>
-      </w:pPr>
-      <w:r>
-        <w:rPr>
-          <w:highlight w:val="none"/>
-          <w:lang w:val="fr-CH"/>
-        </w:rPr>
-      </w:r>
-      <w:r>
-        <w:rPr>
-          <w:highlight w:val="none"/>
-          <w:lang w:val="fr-CH"/>
-        </w:rPr>
-        <w:t xml:space="preserve">A faire : </w:t>
-      </w:r>
+      <w:r/>
       <w:r>
         <w:rPr>
           <w:highlight w:val="none"/>
@@ -7209,138 +7209,7 @@
           <w:lang w:val="fr-CH"/>
         </w:rPr>
       </w:r>
-    </w:p>
-    <w:p>
-      <w:pPr>
-        <w:pStyle w:val="1253"/>
-        <w:numPr>
-          <w:ilvl w:val="0"/>
-          <w:numId w:val="126"/>
-        </w:numPr>
-        <w:pBdr/>
-        <w:spacing/>
-        <w:ind/>
-        <w:jc w:val="both"/>
-        <w:rPr/>
-      </w:pPr>
-      <w:r>
-        <w:rPr>
-          <w:highlight w:val="none"/>
-          <w:lang w:val="fr-CH"/>
-        </w:rPr>
-        <w:t xml:space="preserve">Corriger Schéma de principe 3.0</w:t>
-      </w:r>
-      <w:r>
-        <w:rPr>
-          <w:highlight w:val="none"/>
-          <w:lang w:val="fr-CH"/>
-        </w:rPr>
-      </w:r>
       <w:r/>
-    </w:p>
-    <w:p>
-      <w:pPr>
-        <w:pStyle w:val="1253"/>
-        <w:numPr>
-          <w:ilvl w:val="0"/>
-          <w:numId w:val="126"/>
-        </w:numPr>
-        <w:pBdr/>
-        <w:spacing/>
-        <w:ind/>
-        <w:jc w:val="both"/>
-        <w:rPr/>
-      </w:pPr>
-      <w:r>
-        <w:rPr>
-          <w:highlight w:val="none"/>
-          <w:lang w:val="fr-CH"/>
-        </w:rPr>
-        <w:t xml:space="preserve">Créer les footprints, schématiques</w:t>
-      </w:r>
-      <w:r/>
-    </w:p>
-    <w:p>
-      <w:pPr>
-        <w:pStyle w:val="1253"/>
-        <w:numPr>
-          <w:ilvl w:val="0"/>
-          <w:numId w:val="126"/>
-        </w:numPr>
-        <w:pBdr/>
-        <w:spacing/>
-        <w:ind/>
-        <w:jc w:val="both"/>
-        <w:rPr/>
-      </w:pPr>
-      <w:r>
-        <w:rPr>
-          <w:highlight w:val="none"/>
-          <w:lang w:val="fr-CH"/>
-        </w:rPr>
-        <w:t xml:space="preserve">Trouver solution pour le lecteur RFID et ecran (positionnement)</w:t>
-      </w:r>
-      <w:r>
-        <w:rPr>
-          <w:highlight w:val="none"/>
-          <w:lang w:val="fr-CH"/>
-        </w:rPr>
-      </w:r>
-      <w:r/>
-    </w:p>
-    <w:p>
-      <w:pPr>
-        <w:pStyle w:val="1253"/>
-        <w:numPr>
-          <w:ilvl w:val="0"/>
-          <w:numId w:val="126"/>
-        </w:numPr>
-        <w:pBdr/>
-        <w:spacing/>
-        <w:ind/>
-        <w:jc w:val="both"/>
-        <w:rPr/>
-      </w:pPr>
-      <w:r>
-        <w:rPr>
-          <w:highlight w:val="none"/>
-          <w:lang w:val="fr-CH"/>
-        </w:rPr>
-        <w:t xml:space="preserve">Continuer le document</w:t>
-      </w:r>
-      <w:r/>
-    </w:p>
-    <w:p>
-      <w:pPr>
-        <w:pBdr/>
-        <w:spacing/>
-        <w:ind/>
-        <w:jc w:val="both"/>
-        <w:rPr/>
-      </w:pPr>
-      <w:r/>
-      <w:r/>
-    </w:p>
-    <w:p>
-      <w:pPr>
-        <w:pBdr/>
-        <w:spacing/>
-        <w:ind/>
-        <w:jc w:val="both"/>
-        <w:rPr/>
-      </w:pPr>
-      <w:r>
-        <w:rPr>
-          <w:highlight w:val="none"/>
-          <w:lang w:val="fr-CH"/>
-        </w:rPr>
-      </w:r>
-      <w:r>
-        <w:rPr>
-          <w:highlight w:val="none"/>
-          <w:lang w:val="fr-CH"/>
-        </w:rPr>
-      </w:r>
       <w:r/>
     </w:p>
     <w:sectPr>

</xml_diff>